<commit_message>
Prepare Finance OS V3 hardening
</commit_message>
<xml_diff>
--- a/docs/歲悅會計系統教育訓練手冊.docx
+++ b/docs/歲悅會計系統教育訓練手冊.docx
@@ -553,7 +553,7 @@
                 <w:b w:val="0"/>
                 <w:sz w:val="18"/>
               </w:rPr>
-              <w:t>福利與人事費用相關審核</w:t>
+              <w:t>人事費用相關審核</w:t>
             </w:r>
           </w:p>
         </w:tc>
@@ -578,7 +578,7 @@
                 <w:b w:val="0"/>
                 <w:sz w:val="18"/>
               </w:rPr>
-              <w:t>福利申請、人事費用申請、簽核管理</w:t>
+              <w:t>人事費用申請、簽核管理</w:t>
             </w:r>
           </w:p>
         </w:tc>
@@ -1328,83 +1328,6 @@
                 <w:sz w:val="18"/>
               </w:rPr>
               <w:t>住宿、交通、停車或其他憑據</w:t>
-            </w:r>
-          </w:p>
-        </w:tc>
-      </w:tr>
-      <w:tr>
-        <w:tc>
-          <w:tcPr>
-            <w:tcW w:type="dxa" w:w="1944"/>
-            <w:tcMar>
-              <w:top w:w="80" w:type="dxa"/>
-              <w:start w:w="120" w:type="dxa"/>
-              <w:bottom w:w="80" w:type="dxa"/>
-              <w:end w:w="120" w:type="dxa"/>
-            </w:tcMar>
-            <w:vAlign w:val="center"/>
-          </w:tcPr>
-          <w:p>
-            <w:pPr>
-              <w:spacing w:after="0"/>
-            </w:pPr>
-            <w:r>
-              <w:rPr>
-                <w:rFonts w:ascii="Calibri" w:hAnsi="Calibri"/>
-                <w:b w:val="0"/>
-                <w:sz w:val="18"/>
-              </w:rPr>
-              <w:t>福利申請</w:t>
-            </w:r>
-          </w:p>
-        </w:tc>
-        <w:tc>
-          <w:tcPr>
-            <w:tcW w:type="dxa" w:w="4608"/>
-            <w:tcMar>
-              <w:top w:w="80" w:type="dxa"/>
-              <w:start w:w="120" w:type="dxa"/>
-              <w:bottom w:w="80" w:type="dxa"/>
-              <w:end w:w="120" w:type="dxa"/>
-            </w:tcMar>
-            <w:vAlign w:val="center"/>
-          </w:tcPr>
-          <w:p>
-            <w:pPr>
-              <w:spacing w:after="0"/>
-            </w:pPr>
-            <w:r>
-              <w:rPr>
-                <w:rFonts w:ascii="Calibri" w:hAnsi="Calibri"/>
-                <w:b w:val="0"/>
-                <w:sz w:val="18"/>
-              </w:rPr>
-              <w:t>員工福利、津貼、補助</w:t>
-            </w:r>
-          </w:p>
-        </w:tc>
-        <w:tc>
-          <w:tcPr>
-            <w:tcW w:type="dxa" w:w="2808"/>
-            <w:tcMar>
-              <w:top w:w="80" w:type="dxa"/>
-              <w:start w:w="120" w:type="dxa"/>
-              <w:bottom w:w="80" w:type="dxa"/>
-              <w:end w:w="120" w:type="dxa"/>
-            </w:tcMar>
-            <w:vAlign w:val="center"/>
-          </w:tcPr>
-          <w:p>
-            <w:pPr>
-              <w:spacing w:after="0"/>
-            </w:pPr>
-            <w:r>
-              <w:rPr>
-                <w:rFonts w:ascii="Calibri" w:hAnsi="Calibri"/>
-                <w:b w:val="0"/>
-                <w:sz w:val="18"/>
-              </w:rPr>
-              <w:t>福利證明文件</w:t>
             </w:r>
           </w:p>
         </w:tc>
@@ -2850,58 +2773,6 @@
                 <w:sz w:val="18"/>
               </w:rPr>
               <w:t>分為沒有憑據與發票作廢；發票作廢需上傳原發票電子檔，退費金額不得大於原收款金額。</w:t>
-            </w:r>
-          </w:p>
-        </w:tc>
-      </w:tr>
-      <w:tr>
-        <w:tc>
-          <w:tcPr>
-            <w:tcW w:type="dxa" w:w="2016"/>
-            <w:tcMar>
-              <w:top w:w="80" w:type="dxa"/>
-              <w:start w:w="120" w:type="dxa"/>
-              <w:bottom w:w="80" w:type="dxa"/>
-              <w:end w:w="120" w:type="dxa"/>
-            </w:tcMar>
-            <w:vAlign w:val="center"/>
-          </w:tcPr>
-          <w:p>
-            <w:pPr>
-              <w:spacing w:after="0"/>
-            </w:pPr>
-            <w:r>
-              <w:rPr>
-                <w:rFonts w:ascii="Calibri" w:hAnsi="Calibri"/>
-                <w:b w:val="0"/>
-                <w:sz w:val="18"/>
-              </w:rPr>
-              <w:t>福利申請</w:t>
-            </w:r>
-          </w:p>
-        </w:tc>
-        <w:tc>
-          <w:tcPr>
-            <w:tcW w:type="dxa" w:w="7344"/>
-            <w:tcMar>
-              <w:top w:w="80" w:type="dxa"/>
-              <w:start w:w="120" w:type="dxa"/>
-              <w:bottom w:w="80" w:type="dxa"/>
-              <w:end w:w="120" w:type="dxa"/>
-            </w:tcMar>
-            <w:vAlign w:val="center"/>
-          </w:tcPr>
-          <w:p>
-            <w:pPr>
-              <w:spacing w:after="0"/>
-            </w:pPr>
-            <w:r>
-              <w:rPr>
-                <w:rFonts w:ascii="Calibri" w:hAnsi="Calibri"/>
-                <w:b w:val="0"/>
-                <w:sz w:val="18"/>
-              </w:rPr>
-              <w:t>依福利項目上傳對應證明文件；行政部門主任後會加上人資審核。</w:t>
             </w:r>
           </w:p>
         </w:tc>

</xml_diff>